<commit_message>
Add GEHWOL Classic product photos, strip spaces from image filenames
- Wire up classic-img photos into gehwol-classic.html category cards
  and all 16 produkts-*.html detail pages, plus products.json.
- Strip spaces from every product image filename (classic + both
  polymer-gel categories) so gulp-webp-retina-html can resolve webp
  sources; update all HTML/JSON references accordingly.
- Insert line breaks between swiper slides in the 18 polymer-gel
  detail pages: gulp-webp-retina-html parses one <img> per line, so
  two <img> tags sharing a line were greedily merged into one broken
  <picture>, silently dropping those pages from the build.
</commit_message>
<xml_diff>
--- a/src/GEHWOL CLASSIC.docx
+++ b/src/GEHWOL CLASSIC.docx
@@ -1941,464 +1941,485 @@
         </w:rPr>
         <w:t>saugu mizas eļļa, lavandas eļla, etilspirts.</w:t>
       </w:r>
+    </w:p>
+    <w:p>
+      <w:pPr>
+        <w:rPr>
+          <w:rFonts w:ascii="Arial" w:hAnsi="Arial" w:cs="Arial"/>
+        </w:rPr>
+      </w:pPr>
+    </w:p>
+    <w:p>
+      <w:pPr>
+        <w:rPr>
+          <w:rFonts w:ascii="Arial" w:hAnsi="Arial" w:cs="Arial"/>
+          <w:sz w:val="32"/>
+          <w:szCs w:val="32"/>
+        </w:rPr>
+      </w:pPr>
+      <w:r>
+        <w:rPr>
+          <w:rFonts w:ascii="Arial" w:hAnsi="Arial" w:cs="Arial"/>
+          <w:sz w:val="32"/>
+          <w:szCs w:val="32"/>
+        </w:rPr>
+        <w:t>GEHWOL Fußpuder 100g</w:t>
+      </w:r>
+    </w:p>
+    <w:p>
+      <w:pPr>
+        <w:rPr>
+          <w:rFonts w:ascii="Arial" w:hAnsi="Arial" w:cs="Arial"/>
+          <w:sz w:val="28"/>
+          <w:szCs w:val="28"/>
+        </w:rPr>
+      </w:pPr>
+      <w:r>
+        <w:rPr>
+          <w:rFonts w:ascii="Arial" w:hAnsi="Arial" w:cs="Arial"/>
+          <w:sz w:val="28"/>
+          <w:szCs w:val="28"/>
+        </w:rPr>
+        <w:t>Pūderis pēdu ikdienas kopšanai</w:t>
+      </w:r>
+      <w:r>
+        <w:rPr>
+          <w:rFonts w:ascii="Arial" w:hAnsi="Arial" w:cs="Arial"/>
+          <w:sz w:val="28"/>
+          <w:szCs w:val="28"/>
+        </w:rPr>
+        <w:t>.</w:t>
+      </w:r>
+    </w:p>
+    <w:p>
+      <w:pPr>
+        <w:rPr>
+          <w:rFonts w:ascii="Arial" w:hAnsi="Arial" w:cs="Arial"/>
+        </w:rPr>
+      </w:pPr>
+      <w:r>
+        <w:rPr>
+          <w:rFonts w:ascii="Arial" w:hAnsi="Arial" w:cs="Arial"/>
+        </w:rPr>
+        <w:t xml:space="preserve">Mazina pēdu svīšanu, uztur pēdas sausas, dezodorē. </w:t>
+      </w:r>
+    </w:p>
+    <w:p>
+      <w:pPr>
+        <w:rPr>
+          <w:rFonts w:ascii="Arial" w:hAnsi="Arial" w:cs="Arial"/>
+        </w:rPr>
+      </w:pPr>
+      <w:r>
+        <w:rPr>
+          <w:rFonts w:ascii="Arial" w:hAnsi="Arial" w:cs="Arial"/>
+        </w:rPr>
+        <w:t>Piemē</w:t>
+      </w:r>
+      <w:r>
+        <w:rPr>
+          <w:rFonts w:ascii="Arial" w:hAnsi="Arial" w:cs="Arial"/>
+        </w:rPr>
+        <w:t>rots normālas un sausas ādas kopšanai.</w:t>
+      </w:r>
+    </w:p>
+    <w:p>
+      <w:pPr>
+        <w:rPr>
+          <w:rFonts w:ascii="Arial" w:hAnsi="Arial" w:cs="Arial"/>
+        </w:rPr>
+      </w:pPr>
+      <w:r>
+        <w:rPr>
+          <w:rFonts w:ascii="Arial" w:hAnsi="Arial" w:cs="Arial"/>
+        </w:rPr>
+        <w:t>Piemērots diabēta slimniekiem.</w:t>
+      </w:r>
+    </w:p>
+    <w:p>
+      <w:pPr>
+        <w:rPr>
+          <w:rFonts w:ascii="Arial" w:hAnsi="Arial" w:cs="Arial"/>
+        </w:rPr>
+      </w:pPr>
+      <w:r>
+        <w:rPr>
+          <w:rFonts w:ascii="Arial" w:hAnsi="Arial" w:cs="Arial"/>
+        </w:rPr>
+        <w:t>Aktīvās vielas:</w:t>
+      </w:r>
+    </w:p>
+    <w:p>
+      <w:pPr>
+        <w:rPr>
+          <w:rFonts w:ascii="Arial" w:hAnsi="Arial" w:cs="Arial"/>
+        </w:rPr>
+      </w:pPr>
+      <w:r>
+        <w:rPr>
+          <w:rFonts w:ascii="Arial" w:hAnsi="Arial" w:cs="Arial"/>
+        </w:rPr>
+        <w:t>C</w:t>
+      </w:r>
+      <w:r>
+        <w:rPr>
+          <w:rFonts w:ascii="Arial" w:hAnsi="Arial" w:cs="Arial"/>
+        </w:rPr>
+        <w:t>inka oksīds, citrusau</w:t>
+      </w:r>
+      <w:r>
+        <w:rPr>
+          <w:rFonts w:ascii="Arial" w:hAnsi="Arial" w:cs="Arial"/>
+        </w:rPr>
+        <w:t>gu mizas eļļa, citronzāles eļļa,</w:t>
+      </w:r>
+      <w:r>
+        <w:rPr>
+          <w:rFonts w:ascii="Arial" w:hAnsi="Arial" w:cs="Arial"/>
+          <w:color w:val="FF0000"/>
+        </w:rPr>
+        <w:t xml:space="preserve"> </w:t>
+      </w:r>
+      <w:r>
+        <w:rPr>
+          <w:rFonts w:ascii="Arial" w:hAnsi="Arial" w:cs="Arial"/>
+        </w:rPr>
+        <w:t>kalcija karbonāts.</w:t>
+      </w:r>
+    </w:p>
+    <w:p>
+      <w:pPr>
+        <w:rPr>
+          <w:rFonts w:ascii="Arial" w:hAnsi="Arial" w:cs="Arial"/>
+        </w:rPr>
+      </w:pPr>
+    </w:p>
+    <w:p>
+      <w:pPr>
+        <w:rPr>
+          <w:rFonts w:ascii="Arial" w:hAnsi="Arial" w:cs="Arial"/>
+          <w:sz w:val="32"/>
+          <w:szCs w:val="32"/>
+        </w:rPr>
+      </w:pPr>
+      <w:r>
+        <w:rPr>
+          <w:rFonts w:ascii="Arial" w:hAnsi="Arial" w:cs="Arial"/>
+          <w:sz w:val="32"/>
+          <w:szCs w:val="32"/>
+        </w:rPr>
+        <w:t>GEHWOL Creme-Fußbad 150,1000ml</w:t>
+      </w:r>
+    </w:p>
+    <w:p>
+      <w:pPr>
+        <w:rPr>
+          <w:rFonts w:ascii="Arial" w:hAnsi="Arial" w:cs="Arial"/>
+          <w:sz w:val="28"/>
+          <w:szCs w:val="28"/>
+        </w:rPr>
+      </w:pPr>
+      <w:r>
+        <w:rPr>
+          <w:rFonts w:ascii="Arial" w:hAnsi="Arial" w:cs="Arial"/>
+          <w:sz w:val="28"/>
+          <w:szCs w:val="28"/>
+        </w:rPr>
+        <w:t>Atsvaidzinošs līdzeklis pēdu vannošanai.</w:t>
+      </w:r>
+    </w:p>
+    <w:p>
+      <w:pPr>
+        <w:rPr>
+          <w:rFonts w:ascii="Arial" w:hAnsi="Arial" w:cs="Arial"/>
+        </w:rPr>
+      </w:pPr>
+      <w:r>
+        <w:rPr>
+          <w:rFonts w:ascii="Arial" w:hAnsi="Arial" w:cs="Arial"/>
+        </w:rPr>
+        <w:t>Veicina</w:t>
+      </w:r>
+      <w:r>
+        <w:rPr>
+          <w:rFonts w:ascii="Arial" w:hAnsi="Arial" w:cs="Arial"/>
+        </w:rPr>
+        <w:t xml:space="preserve"> asinsriti, </w:t>
+      </w:r>
+      <w:r>
+        <w:rPr>
+          <w:rFonts w:ascii="Arial" w:hAnsi="Arial" w:cs="Arial"/>
+        </w:rPr>
+        <w:t xml:space="preserve">atsvaidzina nogurušas, sāpošas, piepūlētas kājas, </w:t>
+      </w:r>
+      <w:r>
+        <w:rPr>
+          <w:rFonts w:ascii="Arial" w:hAnsi="Arial" w:cs="Arial"/>
+        </w:rPr>
+        <w:t xml:space="preserve">attīra ādas poras, </w:t>
+      </w:r>
+      <w:r>
+        <w:rPr>
+          <w:rFonts w:ascii="Arial" w:hAnsi="Arial" w:cs="Arial"/>
+        </w:rPr>
+        <w:t xml:space="preserve">mīkstina, mitrina ādu, dezodorē. Regulāra vannošana mazina </w:t>
+      </w:r>
+      <w:r>
+        <w:rPr>
+          <w:rFonts w:ascii="Arial" w:hAnsi="Arial" w:cs="Arial"/>
+        </w:rPr>
+        <w:t>pēdu sēnīšu slimību attīstības iespēju</w:t>
+      </w:r>
+      <w:r>
+        <w:rPr>
+          <w:rFonts w:ascii="Arial" w:hAnsi="Arial" w:cs="Arial"/>
+        </w:rPr>
+        <w:t xml:space="preserve">. </w:t>
+      </w:r>
+    </w:p>
+    <w:p>
+      <w:pPr>
+        <w:rPr>
+          <w:rFonts w:ascii="Arial" w:hAnsi="Arial" w:cs="Arial"/>
+        </w:rPr>
+      </w:pPr>
+      <w:r>
+        <w:rPr>
+          <w:rFonts w:ascii="Arial" w:hAnsi="Arial" w:cs="Arial"/>
+        </w:rPr>
+        <w:t>Piemērots normā</w:t>
+      </w:r>
+      <w:r>
+        <w:rPr>
+          <w:rFonts w:ascii="Arial" w:hAnsi="Arial" w:cs="Arial"/>
+        </w:rPr>
+        <w:t>las un sausas pēdu ādas kopšanai.</w:t>
+      </w:r>
+    </w:p>
+    <w:p>
+      <w:pPr>
+        <w:rPr>
+          <w:rFonts w:ascii="Arial" w:hAnsi="Arial" w:cs="Arial"/>
+        </w:rPr>
+      </w:pPr>
+      <w:r>
+        <w:rPr>
+          <w:rFonts w:ascii="Arial" w:hAnsi="Arial" w:cs="Arial"/>
+        </w:rPr>
+        <w:t>Piemērots diabēta slimniekiem.</w:t>
+      </w:r>
+    </w:p>
+    <w:p>
+      <w:pPr>
+        <w:rPr>
+          <w:rFonts w:ascii="Arial" w:hAnsi="Arial" w:cs="Arial"/>
+        </w:rPr>
+      </w:pPr>
+      <w:r>
+        <w:rPr>
+          <w:rFonts w:ascii="Arial" w:hAnsi="Arial" w:cs="Arial"/>
+        </w:rPr>
+        <w:t>Aktīvās vielas:</w:t>
+      </w:r>
+    </w:p>
+    <w:p>
+      <w:pPr>
+        <w:rPr>
+          <w:rFonts w:ascii="Arial" w:eastAsia="Times New Roman" w:hAnsi="Arial" w:cs="Arial"/>
+          <w:lang w:eastAsia="lv-LV"/>
+        </w:rPr>
+      </w:pPr>
+      <w:r>
+        <w:rPr>
+          <w:rFonts w:ascii="Arial" w:eastAsia="Times New Roman" w:hAnsi="Arial" w:cs="Arial"/>
+          <w:lang w:eastAsia="lv-LV"/>
+        </w:rPr>
+        <w:t>Sāls,</w:t>
+      </w:r>
+      <w:r>
+        <w:rPr>
+          <w:rFonts w:ascii="Arial" w:eastAsia="Times New Roman" w:hAnsi="Arial" w:cs="Arial"/>
+          <w:lang w:eastAsia="lv-LV"/>
+        </w:rPr>
+        <w:t xml:space="preserve"> mentols</w:t>
+      </w:r>
+      <w:r>
+        <w:rPr>
+          <w:rFonts w:ascii="Arial" w:eastAsia="Times New Roman" w:hAnsi="Arial" w:cs="Arial"/>
+          <w:lang w:eastAsia="lv-LV"/>
+        </w:rPr>
+        <w:t>, lavandas eļļa,</w:t>
+      </w:r>
+      <w:r>
+        <w:rPr>
+          <w:rFonts w:ascii="Arial" w:eastAsia="Times New Roman" w:hAnsi="Arial" w:cs="Arial"/>
+          <w:lang w:eastAsia="lv-LV"/>
+        </w:rPr>
+        <w:t xml:space="preserve"> rozmarīna eļļa.</w:t>
+      </w:r>
+    </w:p>
+    <w:p>
+      <w:pPr>
+        <w:rPr>
+          <w:rFonts w:ascii="Arial" w:eastAsia="Times New Roman" w:hAnsi="Arial" w:cs="Arial"/>
+          <w:lang w:eastAsia="lv-LV"/>
+        </w:rPr>
+      </w:pPr>
+    </w:p>
+    <w:p>
+      <w:pPr>
+        <w:rPr>
+          <w:rFonts w:ascii="Arial" w:eastAsia="Times New Roman" w:hAnsi="Arial" w:cs="Arial"/>
+          <w:sz w:val="32"/>
+          <w:szCs w:val="32"/>
+          <w:lang w:eastAsia="lv-LV"/>
+        </w:rPr>
+      </w:pPr>
+      <w:r>
+        <w:rPr>
+          <w:rFonts w:ascii="Arial" w:eastAsia="Times New Roman" w:hAnsi="Arial" w:cs="Arial"/>
+          <w:sz w:val="32"/>
+          <w:szCs w:val="32"/>
+          <w:lang w:eastAsia="lv-LV"/>
+        </w:rPr>
+        <w:t>GEHWOL Fußbad 200 (20gx10), 250,</w:t>
+      </w:r>
+      <w:r>
+        <w:rPr>
+          <w:rFonts w:ascii="Arial" w:eastAsia="Times New Roman" w:hAnsi="Arial" w:cs="Arial"/>
+          <w:sz w:val="32"/>
+          <w:szCs w:val="32"/>
+          <w:lang w:eastAsia="lv-LV"/>
+        </w:rPr>
+        <w:t xml:space="preserve"> </w:t>
+      </w:r>
+      <w:r>
+        <w:rPr>
+          <w:rFonts w:ascii="Arial" w:eastAsia="Times New Roman" w:hAnsi="Arial" w:cs="Arial"/>
+          <w:sz w:val="32"/>
+          <w:szCs w:val="32"/>
+          <w:lang w:eastAsia="lv-LV"/>
+        </w:rPr>
+        <w:t>400,</w:t>
+      </w:r>
+      <w:r>
+        <w:rPr>
+          <w:rFonts w:ascii="Arial" w:eastAsia="Times New Roman" w:hAnsi="Arial" w:cs="Arial"/>
+          <w:sz w:val="32"/>
+          <w:szCs w:val="32"/>
+          <w:lang w:eastAsia="lv-LV"/>
+        </w:rPr>
+        <w:t xml:space="preserve"> </w:t>
+      </w:r>
+      <w:r>
+        <w:rPr>
+          <w:rFonts w:ascii="Arial" w:eastAsia="Times New Roman" w:hAnsi="Arial" w:cs="Arial"/>
+          <w:sz w:val="32"/>
+          <w:szCs w:val="32"/>
+          <w:lang w:eastAsia="lv-LV"/>
+        </w:rPr>
+        <w:t>5000,10000g</w:t>
+      </w:r>
+    </w:p>
+    <w:p>
+      <w:pPr>
+        <w:rPr>
+          <w:rFonts w:ascii="Arial" w:eastAsia="Times New Roman" w:hAnsi="Arial" w:cs="Arial"/>
+          <w:sz w:val="28"/>
+          <w:szCs w:val="28"/>
+          <w:lang w:eastAsia="lv-LV"/>
+        </w:rPr>
+      </w:pPr>
+      <w:r>
+        <w:rPr>
+          <w:rFonts w:ascii="Arial" w:eastAsia="Times New Roman" w:hAnsi="Arial" w:cs="Arial"/>
+          <w:sz w:val="28"/>
+          <w:szCs w:val="28"/>
+          <w:lang w:eastAsia="lv-LV"/>
+        </w:rPr>
+        <w:t xml:space="preserve">Sāls ar augu ēteriskajām eļļām pēdu vannošanai. </w:t>
+      </w:r>
+    </w:p>
+    <w:p>
+      <w:pPr>
+        <w:rPr>
+          <w:rFonts w:ascii="Arial" w:eastAsia="Times New Roman" w:hAnsi="Arial" w:cs="Arial"/>
+          <w:lang w:eastAsia="lv-LV"/>
+        </w:rPr>
+      </w:pPr>
+      <w:r>
+        <w:rPr>
+          <w:rFonts w:ascii="Arial" w:eastAsia="Times New Roman" w:hAnsi="Arial" w:cs="Arial"/>
+          <w:lang w:eastAsia="lv-LV"/>
+        </w:rPr>
+        <w:t xml:space="preserve">Dziļi attīra, mitrina, mīkstina ādu, </w:t>
+      </w:r>
+      <w:r>
+        <w:rPr>
+          <w:rFonts w:ascii="Arial" w:eastAsia="Times New Roman" w:hAnsi="Arial" w:cs="Arial"/>
+          <w:lang w:eastAsia="lv-LV"/>
+        </w:rPr>
+        <w:t>veicina</w:t>
+      </w:r>
+      <w:r>
+        <w:rPr>
+          <w:rFonts w:ascii="Arial" w:eastAsia="Times New Roman" w:hAnsi="Arial" w:cs="Arial"/>
+          <w:lang w:eastAsia="lv-LV"/>
+        </w:rPr>
+        <w:t xml:space="preserve"> asinsriti, mazina nogurumu, mazina ādas kairinājumu, dezodorē. Efekts ilgstošs. </w:t>
+      </w:r>
+    </w:p>
+    <w:p>
+      <w:pPr>
+        <w:rPr>
+          <w:rFonts w:ascii="Arial" w:eastAsia="Times New Roman" w:hAnsi="Arial" w:cs="Arial"/>
+          <w:lang w:eastAsia="lv-LV"/>
+        </w:rPr>
+      </w:pPr>
+      <w:r>
+        <w:rPr>
+          <w:rFonts w:ascii="Arial" w:eastAsia="Times New Roman" w:hAnsi="Arial" w:cs="Arial"/>
+          <w:lang w:eastAsia="lv-LV"/>
+        </w:rPr>
+        <w:t>Piemērot</w:t>
+      </w:r>
+      <w:r>
+        <w:rPr>
+          <w:rFonts w:ascii="Arial" w:eastAsia="Times New Roman" w:hAnsi="Arial" w:cs="Arial"/>
+          <w:lang w:eastAsia="lv-LV"/>
+        </w:rPr>
+        <w:t>s</w:t>
+      </w:r>
+      <w:r>
+        <w:rPr>
+          <w:rFonts w:ascii="Arial" w:eastAsia="Times New Roman" w:hAnsi="Arial" w:cs="Arial"/>
+          <w:lang w:eastAsia="lv-LV"/>
+        </w:rPr>
+        <w:t xml:space="preserve"> normālas un sausas ādas kopšanai.</w:t>
+      </w:r>
+    </w:p>
+    <w:p>
+      <w:pPr>
+        <w:rPr>
+          <w:rFonts w:ascii="Arial" w:eastAsia="Times New Roman" w:hAnsi="Arial" w:cs="Arial"/>
+          <w:lang w:eastAsia="lv-LV"/>
+        </w:rPr>
+      </w:pPr>
+      <w:r>
+        <w:rPr>
+          <w:rFonts w:ascii="Arial" w:eastAsia="Times New Roman" w:hAnsi="Arial" w:cs="Arial"/>
+          <w:lang w:eastAsia="lv-LV"/>
+        </w:rPr>
+        <w:t>Piemērots</w:t>
+      </w:r>
       <w:bookmarkStart w:id="0" w:name="_GoBack"/>
       <w:bookmarkEnd w:id="0"/>
-    </w:p>
-    <w:p>
-      <w:pPr>
-        <w:rPr>
-          <w:rFonts w:ascii="Arial" w:hAnsi="Arial" w:cs="Arial"/>
-        </w:rPr>
-      </w:pPr>
-    </w:p>
-    <w:p>
-      <w:pPr>
-        <w:rPr>
-          <w:rFonts w:ascii="Arial" w:hAnsi="Arial" w:cs="Arial"/>
-          <w:sz w:val="32"/>
-          <w:szCs w:val="32"/>
-        </w:rPr>
-      </w:pPr>
-      <w:r>
-        <w:rPr>
-          <w:rFonts w:ascii="Arial" w:hAnsi="Arial" w:cs="Arial"/>
-          <w:sz w:val="32"/>
-          <w:szCs w:val="32"/>
-        </w:rPr>
-        <w:t>GEHWOL Fußpuder 100g</w:t>
-      </w:r>
-    </w:p>
-    <w:p>
-      <w:pPr>
-        <w:rPr>
-          <w:rFonts w:ascii="Arial" w:hAnsi="Arial" w:cs="Arial"/>
-          <w:sz w:val="28"/>
-          <w:szCs w:val="28"/>
-        </w:rPr>
-      </w:pPr>
-      <w:r>
-        <w:rPr>
-          <w:rFonts w:ascii="Arial" w:hAnsi="Arial" w:cs="Arial"/>
-          <w:sz w:val="28"/>
-          <w:szCs w:val="28"/>
-        </w:rPr>
-        <w:t>Pūderis pēdu ikdienas kopšanai</w:t>
-      </w:r>
-      <w:r>
-        <w:rPr>
-          <w:rFonts w:ascii="Arial" w:hAnsi="Arial" w:cs="Arial"/>
-          <w:sz w:val="28"/>
-          <w:szCs w:val="28"/>
-        </w:rPr>
-        <w:t>.</w:t>
-      </w:r>
-    </w:p>
-    <w:p>
-      <w:pPr>
-        <w:rPr>
-          <w:rFonts w:ascii="Arial" w:hAnsi="Arial" w:cs="Arial"/>
-        </w:rPr>
-      </w:pPr>
-      <w:r>
-        <w:rPr>
-          <w:rFonts w:ascii="Arial" w:hAnsi="Arial" w:cs="Arial"/>
-        </w:rPr>
-        <w:t xml:space="preserve">Mazina pēdu svīšanu, uztur pēdas sausas, dezodorē. </w:t>
-      </w:r>
-    </w:p>
-    <w:p>
-      <w:pPr>
-        <w:rPr>
-          <w:rFonts w:ascii="Arial" w:hAnsi="Arial" w:cs="Arial"/>
-        </w:rPr>
-      </w:pPr>
-      <w:r>
-        <w:rPr>
-          <w:rFonts w:ascii="Arial" w:hAnsi="Arial" w:cs="Arial"/>
-        </w:rPr>
-        <w:t>Piemē</w:t>
-      </w:r>
-      <w:r>
-        <w:rPr>
-          <w:rFonts w:ascii="Arial" w:hAnsi="Arial" w:cs="Arial"/>
-        </w:rPr>
-        <w:t>rots normālas un sausas ādas kopšanai.</w:t>
-      </w:r>
-    </w:p>
-    <w:p>
-      <w:pPr>
-        <w:rPr>
-          <w:rFonts w:ascii="Arial" w:hAnsi="Arial" w:cs="Arial"/>
-        </w:rPr>
-      </w:pPr>
-      <w:r>
-        <w:rPr>
-          <w:rFonts w:ascii="Arial" w:hAnsi="Arial" w:cs="Arial"/>
-        </w:rPr>
-        <w:t>Piemērots diabēta slimniekiem.</w:t>
-      </w:r>
-    </w:p>
-    <w:p>
-      <w:pPr>
-        <w:rPr>
-          <w:rFonts w:ascii="Arial" w:hAnsi="Arial" w:cs="Arial"/>
-        </w:rPr>
-      </w:pPr>
-      <w:r>
-        <w:rPr>
-          <w:rFonts w:ascii="Arial" w:hAnsi="Arial" w:cs="Arial"/>
-        </w:rPr>
-        <w:t>Aktīvās vielas:</w:t>
-      </w:r>
-    </w:p>
-    <w:p>
-      <w:pPr>
-        <w:rPr>
-          <w:rFonts w:ascii="Arial" w:hAnsi="Arial" w:cs="Arial"/>
-        </w:rPr>
-      </w:pPr>
-      <w:r>
-        <w:rPr>
-          <w:rFonts w:ascii="Arial" w:hAnsi="Arial" w:cs="Arial"/>
-        </w:rPr>
-        <w:t>C</w:t>
-      </w:r>
-      <w:r>
-        <w:rPr>
-          <w:rFonts w:ascii="Arial" w:hAnsi="Arial" w:cs="Arial"/>
-        </w:rPr>
-        <w:t>inka oksīds, citrusau</w:t>
-      </w:r>
-      <w:r>
-        <w:rPr>
-          <w:rFonts w:ascii="Arial" w:hAnsi="Arial" w:cs="Arial"/>
-        </w:rPr>
-        <w:t>gu mizas eļļa, citronzāles eļļa,</w:t>
-      </w:r>
-      <w:r>
-        <w:rPr>
-          <w:rFonts w:ascii="Arial" w:hAnsi="Arial" w:cs="Arial"/>
-          <w:color w:val="FF0000"/>
-        </w:rPr>
-        <w:t xml:space="preserve"> </w:t>
-      </w:r>
-      <w:r>
-        <w:rPr>
-          <w:rFonts w:ascii="Arial" w:hAnsi="Arial" w:cs="Arial"/>
-        </w:rPr>
-        <w:t>kalcija karbonāts.</w:t>
-      </w:r>
-    </w:p>
-    <w:p>
-      <w:pPr>
-        <w:rPr>
-          <w:rFonts w:ascii="Arial" w:hAnsi="Arial" w:cs="Arial"/>
-        </w:rPr>
-      </w:pPr>
-    </w:p>
-    <w:p>
-      <w:pPr>
-        <w:rPr>
-          <w:rFonts w:ascii="Arial" w:hAnsi="Arial" w:cs="Arial"/>
-          <w:sz w:val="32"/>
-          <w:szCs w:val="32"/>
-        </w:rPr>
-      </w:pPr>
-      <w:r>
-        <w:rPr>
-          <w:rFonts w:ascii="Arial" w:hAnsi="Arial" w:cs="Arial"/>
-          <w:sz w:val="32"/>
-          <w:szCs w:val="32"/>
-        </w:rPr>
-        <w:t>GEHWOL Creme-Fußbad 150,1000ml</w:t>
-      </w:r>
-    </w:p>
-    <w:p>
-      <w:pPr>
-        <w:rPr>
-          <w:rFonts w:ascii="Arial" w:hAnsi="Arial" w:cs="Arial"/>
-          <w:sz w:val="28"/>
-          <w:szCs w:val="28"/>
-        </w:rPr>
-      </w:pPr>
-      <w:r>
-        <w:rPr>
-          <w:rFonts w:ascii="Arial" w:hAnsi="Arial" w:cs="Arial"/>
-          <w:sz w:val="28"/>
-          <w:szCs w:val="28"/>
-        </w:rPr>
-        <w:t>Atsvaidzinošs līdzeklis pēdu vannošanai.</w:t>
-      </w:r>
-    </w:p>
-    <w:p>
-      <w:pPr>
-        <w:rPr>
-          <w:rFonts w:ascii="Arial" w:hAnsi="Arial" w:cs="Arial"/>
-        </w:rPr>
-      </w:pPr>
-      <w:r>
-        <w:rPr>
-          <w:rFonts w:ascii="Arial" w:hAnsi="Arial" w:cs="Arial"/>
-        </w:rPr>
-        <w:t>Veicina</w:t>
-      </w:r>
-      <w:r>
-        <w:rPr>
-          <w:rFonts w:ascii="Arial" w:hAnsi="Arial" w:cs="Arial"/>
-        </w:rPr>
-        <w:t xml:space="preserve"> asinsriti, </w:t>
-      </w:r>
-      <w:r>
-        <w:rPr>
-          <w:rFonts w:ascii="Arial" w:hAnsi="Arial" w:cs="Arial"/>
-        </w:rPr>
-        <w:t xml:space="preserve">atsvaidzina nogurušas, sāpošas, piepūlētas kājas, </w:t>
-      </w:r>
-      <w:r>
-        <w:rPr>
-          <w:rFonts w:ascii="Arial" w:hAnsi="Arial" w:cs="Arial"/>
-        </w:rPr>
-        <w:t xml:space="preserve">attīra ādas poras, </w:t>
-      </w:r>
-      <w:r>
-        <w:rPr>
-          <w:rFonts w:ascii="Arial" w:hAnsi="Arial" w:cs="Arial"/>
-        </w:rPr>
-        <w:t xml:space="preserve">mīkstina, mitrina ādu, dezodorē. Regulāra vannošana mazina </w:t>
-      </w:r>
-      <w:r>
-        <w:rPr>
-          <w:rFonts w:ascii="Arial" w:hAnsi="Arial" w:cs="Arial"/>
-        </w:rPr>
-        <w:t>pēdu sēnīšu slimību attīstības iespēju</w:t>
-      </w:r>
-      <w:r>
-        <w:rPr>
-          <w:rFonts w:ascii="Arial" w:hAnsi="Arial" w:cs="Arial"/>
-        </w:rPr>
-        <w:t xml:space="preserve">. </w:t>
-      </w:r>
-    </w:p>
-    <w:p>
-      <w:pPr>
-        <w:rPr>
-          <w:rFonts w:ascii="Arial" w:hAnsi="Arial" w:cs="Arial"/>
-        </w:rPr>
-      </w:pPr>
-      <w:r>
-        <w:rPr>
-          <w:rFonts w:ascii="Arial" w:hAnsi="Arial" w:cs="Arial"/>
-        </w:rPr>
-        <w:t>Piemērots normā</w:t>
-      </w:r>
-      <w:r>
-        <w:rPr>
-          <w:rFonts w:ascii="Arial" w:hAnsi="Arial" w:cs="Arial"/>
-        </w:rPr>
-        <w:t>las un sausas pēdu ādas kopšanai.</w:t>
-      </w:r>
-    </w:p>
-    <w:p>
-      <w:pPr>
-        <w:rPr>
-          <w:rFonts w:ascii="Arial" w:hAnsi="Arial" w:cs="Arial"/>
-        </w:rPr>
-      </w:pPr>
-      <w:r>
-        <w:rPr>
-          <w:rFonts w:ascii="Arial" w:hAnsi="Arial" w:cs="Arial"/>
-        </w:rPr>
-        <w:t>Piemērots diabēta slimniekiem.</w:t>
-      </w:r>
-    </w:p>
-    <w:p>
-      <w:pPr>
-        <w:rPr>
-          <w:rFonts w:ascii="Arial" w:hAnsi="Arial" w:cs="Arial"/>
-        </w:rPr>
-      </w:pPr>
-      <w:r>
-        <w:rPr>
-          <w:rFonts w:ascii="Arial" w:hAnsi="Arial" w:cs="Arial"/>
-        </w:rPr>
-        <w:t>Aktīvās vielas:</w:t>
-      </w:r>
-    </w:p>
-    <w:p>
-      <w:pPr>
-        <w:rPr>
-          <w:rFonts w:ascii="Arial" w:eastAsia="Times New Roman" w:hAnsi="Arial" w:cs="Arial"/>
-          <w:lang w:eastAsia="lv-LV"/>
-        </w:rPr>
-      </w:pPr>
-      <w:r>
-        <w:rPr>
-          <w:rFonts w:ascii="Arial" w:eastAsia="Times New Roman" w:hAnsi="Arial" w:cs="Arial"/>
-          <w:lang w:eastAsia="lv-LV"/>
-        </w:rPr>
-        <w:t>Sāls,</w:t>
-      </w:r>
-      <w:r>
-        <w:rPr>
-          <w:rFonts w:ascii="Arial" w:eastAsia="Times New Roman" w:hAnsi="Arial" w:cs="Arial"/>
-          <w:lang w:eastAsia="lv-LV"/>
-        </w:rPr>
-        <w:t xml:space="preserve"> mentols</w:t>
-      </w:r>
-      <w:r>
-        <w:rPr>
-          <w:rFonts w:ascii="Arial" w:eastAsia="Times New Roman" w:hAnsi="Arial" w:cs="Arial"/>
-          <w:lang w:eastAsia="lv-LV"/>
-        </w:rPr>
-        <w:t>, lavandas eļļa,</w:t>
-      </w:r>
-      <w:r>
-        <w:rPr>
-          <w:rFonts w:ascii="Arial" w:eastAsia="Times New Roman" w:hAnsi="Arial" w:cs="Arial"/>
-          <w:lang w:eastAsia="lv-LV"/>
-        </w:rPr>
-        <w:t xml:space="preserve"> rozmarīna eļļa.</w:t>
-      </w:r>
-    </w:p>
-    <w:p>
-      <w:pPr>
-        <w:rPr>
-          <w:rFonts w:ascii="Arial" w:eastAsia="Times New Roman" w:hAnsi="Arial" w:cs="Arial"/>
-          <w:lang w:eastAsia="lv-LV"/>
-        </w:rPr>
-      </w:pPr>
-    </w:p>
-    <w:p>
-      <w:pPr>
-        <w:rPr>
-          <w:rFonts w:ascii="Arial" w:eastAsia="Times New Roman" w:hAnsi="Arial" w:cs="Arial"/>
-          <w:sz w:val="32"/>
-          <w:szCs w:val="32"/>
-          <w:lang w:eastAsia="lv-LV"/>
-        </w:rPr>
-      </w:pPr>
-      <w:r>
-        <w:rPr>
-          <w:rFonts w:ascii="Arial" w:eastAsia="Times New Roman" w:hAnsi="Arial" w:cs="Arial"/>
-          <w:sz w:val="32"/>
-          <w:szCs w:val="32"/>
-          <w:lang w:eastAsia="lv-LV"/>
-        </w:rPr>
-        <w:t>GEHWOL Fußbad 200 (20gx10), 250,</w:t>
-      </w:r>
-      <w:r>
-        <w:rPr>
-          <w:rFonts w:ascii="Arial" w:eastAsia="Times New Roman" w:hAnsi="Arial" w:cs="Arial"/>
-          <w:sz w:val="32"/>
-          <w:szCs w:val="32"/>
-          <w:lang w:eastAsia="lv-LV"/>
-        </w:rPr>
-        <w:t xml:space="preserve"> </w:t>
-      </w:r>
-      <w:r>
-        <w:rPr>
-          <w:rFonts w:ascii="Arial" w:eastAsia="Times New Roman" w:hAnsi="Arial" w:cs="Arial"/>
-          <w:sz w:val="32"/>
-          <w:szCs w:val="32"/>
-          <w:lang w:eastAsia="lv-LV"/>
-        </w:rPr>
-        <w:t>400,</w:t>
-      </w:r>
-      <w:r>
-        <w:rPr>
-          <w:rFonts w:ascii="Arial" w:eastAsia="Times New Roman" w:hAnsi="Arial" w:cs="Arial"/>
-          <w:sz w:val="32"/>
-          <w:szCs w:val="32"/>
-          <w:lang w:eastAsia="lv-LV"/>
-        </w:rPr>
-        <w:t xml:space="preserve"> </w:t>
-      </w:r>
-      <w:r>
-        <w:rPr>
-          <w:rFonts w:ascii="Arial" w:eastAsia="Times New Roman" w:hAnsi="Arial" w:cs="Arial"/>
-          <w:sz w:val="32"/>
-          <w:szCs w:val="32"/>
-          <w:lang w:eastAsia="lv-LV"/>
-        </w:rPr>
-        <w:t>5000,10000g</w:t>
-      </w:r>
-    </w:p>
-    <w:p>
-      <w:pPr>
-        <w:rPr>
-          <w:rFonts w:ascii="Arial" w:eastAsia="Times New Roman" w:hAnsi="Arial" w:cs="Arial"/>
-          <w:sz w:val="28"/>
-          <w:szCs w:val="28"/>
-          <w:lang w:eastAsia="lv-LV"/>
-        </w:rPr>
-      </w:pPr>
-      <w:r>
-        <w:rPr>
-          <w:rFonts w:ascii="Arial" w:eastAsia="Times New Roman" w:hAnsi="Arial" w:cs="Arial"/>
-          <w:sz w:val="28"/>
-          <w:szCs w:val="28"/>
-          <w:lang w:eastAsia="lv-LV"/>
-        </w:rPr>
-        <w:t xml:space="preserve">Sāls ar augu ēteriskajām eļļām pēdu vannošanai. </w:t>
-      </w:r>
-    </w:p>
-    <w:p>
-      <w:pPr>
-        <w:rPr>
-          <w:rFonts w:ascii="Arial" w:eastAsia="Times New Roman" w:hAnsi="Arial" w:cs="Arial"/>
-          <w:lang w:eastAsia="lv-LV"/>
-        </w:rPr>
-      </w:pPr>
-      <w:r>
-        <w:rPr>
-          <w:rFonts w:ascii="Arial" w:eastAsia="Times New Roman" w:hAnsi="Arial" w:cs="Arial"/>
-          <w:lang w:eastAsia="lv-LV"/>
-        </w:rPr>
-        <w:t xml:space="preserve">Dziļi attīra, mitrina, mīkstina ādu, </w:t>
-      </w:r>
-      <w:r>
-        <w:rPr>
-          <w:rFonts w:ascii="Arial" w:eastAsia="Times New Roman" w:hAnsi="Arial" w:cs="Arial"/>
-          <w:lang w:eastAsia="lv-LV"/>
-        </w:rPr>
-        <w:t>veicina</w:t>
-      </w:r>
-      <w:r>
-        <w:rPr>
-          <w:rFonts w:ascii="Arial" w:eastAsia="Times New Roman" w:hAnsi="Arial" w:cs="Arial"/>
-          <w:lang w:eastAsia="lv-LV"/>
-        </w:rPr>
-        <w:t xml:space="preserve"> asinsriti, mazina nogurumu, mazina ādas kairinājumu, dezodorē. Efekts ilgstošs. </w:t>
-      </w:r>
-    </w:p>
-    <w:p>
-      <w:pPr>
-        <w:rPr>
-          <w:rFonts w:ascii="Arial" w:eastAsia="Times New Roman" w:hAnsi="Arial" w:cs="Arial"/>
-          <w:lang w:eastAsia="lv-LV"/>
-        </w:rPr>
-      </w:pPr>
-      <w:r>
-        <w:rPr>
-          <w:rFonts w:ascii="Arial" w:eastAsia="Times New Roman" w:hAnsi="Arial" w:cs="Arial"/>
-          <w:lang w:eastAsia="lv-LV"/>
-        </w:rPr>
-        <w:t>Piemērota normālas un sausas ādas kopšanai.</w:t>
-      </w:r>
-    </w:p>
-    <w:p>
-      <w:pPr>
-        <w:rPr>
-          <w:rFonts w:ascii="Arial" w:eastAsia="Times New Roman" w:hAnsi="Arial" w:cs="Arial"/>
-          <w:lang w:eastAsia="lv-LV"/>
-        </w:rPr>
-      </w:pPr>
-      <w:r>
-        <w:rPr>
-          <w:rFonts w:ascii="Arial" w:eastAsia="Times New Roman" w:hAnsi="Arial" w:cs="Arial"/>
-          <w:lang w:eastAsia="lv-LV"/>
-        </w:rPr>
-        <w:t>Piemērota diabēta slimniekiem.</w:t>
+      <w:r>
+        <w:rPr>
+          <w:rFonts w:ascii="Arial" w:eastAsia="Times New Roman" w:hAnsi="Arial" w:cs="Arial"/>
+          <w:lang w:eastAsia="lv-LV"/>
+        </w:rPr>
+        <w:t xml:space="preserve"> diabēta slimniekiem.</w:t>
       </w:r>
     </w:p>
     <w:p>

</xml_diff>